<commit_message>
Updated the Secure Settings - Select Options Procedure (experimental option note)
</commit_message>
<xml_diff>
--- a/source/reference_documents/tertiary_documents/implementation/Secure Settings/select options/Secure Settings - Select Options.docx
+++ b/source/reference_documents/tertiary_documents/implementation/Secure Settings/select options/Secure Settings - Select Options.docx
@@ -43,7 +43,7 @@
         <w:t xml:space="preserve">Version </w:t>
       </w:r>
       <w:r>
-        <w:t>3</w:t>
+        <w:t>4</w:t>
       </w:r>
     </w:p>
     <w:p>
@@ -60,7 +60,7 @@
         <w:rPr>
           <w:noProof/>
         </w:rPr>
-        <w:t>9/8/25 11:50 AM</w:t>
+        <w:t>9/29/25 10:39 AM</w:t>
       </w:r>
       <w:r>
         <w:fldChar w:fldCharType="end"/>
@@ -253,6 +253,9 @@
       </w:r>
       <w:r>
         <w:t>. This is necessary given the nature of safety-critical, cyber-physical systems</w:t>
+      </w:r>
+      <w:r>
+        <w:t>.</w:t>
       </w:r>
     </w:p>
     <w:p>
@@ -1283,6 +1286,32 @@
       <w:r>
         <w:t>Option use consumes excessive time</w:t>
       </w:r>
+    </w:p>
+    <w:p>
+      <w:pPr>
+        <w:ind w:left="720" w:hanging="720"/>
+      </w:pPr>
+      <w:r>
+        <w:rPr>
+          <w:b/>
+          <w:bCs/>
+          <w:color w:val="0070C0"/>
+        </w:rPr>
+        <w:t>Note:</w:t>
+      </w:r>
+      <w:r>
+        <w:rPr>
+          <w:b/>
+          <w:bCs/>
+          <w:color w:val="0070C0"/>
+        </w:rPr>
+        <w:tab/>
+      </w:r>
+      <w:r>
+        <w:t>The selection of experimental (beta test) options is not recommended when the tool under consideration is part of the code generation process.</w:t>
+      </w:r>
+    </w:p>
+    <w:p>
       <w:r>
         <w:br w:type="page"/>
       </w:r>

</xml_diff>